<commit_message>
Applying some fixes in the corpus
</commit_message>
<xml_diff>
--- a/original/nao_articulados/sc_cosit_194_20150805.docx
+++ b/original/nao_articulados/sc_cosit_194_20150805.docx
@@ -89,7 +89,151 @@
           <w:color w:val="162937"/>
           <w:lang w:val="pt-BR"/>
         </w:rPr>
-        <w:t>A Receita Federal do Brasil está impedida de constituir ouexigir créditos tributários relativos à incidência do IRPF sobre osrendimentos do trabalho recebidos por peritos de assistência técnicacontratados no Brasil para atuarem como consultores da ONU ou desuas Agências Especializadas, nem inscrevê-los em Dívida Ativa daUnião, devendo, ainda, rever de ofício os lançamentos e as inscriçõesjá efetuadas, respeitados os prazos que limitam o exercício de direitospor parte dos contribuintes, em razão das disposições expressas noREsp nº 1.306.393/DF, julgado pelo STJ na sistemática prevista noart. 543-C do Código de Processo Civil (CPC), e tendo em vista aNota PGFN/CRJ nº 1.549, de 2012.</w:t>
+        <w:t>A Receita Federal do Brasil está impedida de constituir ouexigir créditos tributários relativos à incidência do IRPF sobre osrendimentos do trabalho recebidos por peritos de assistência técnica</w:t>
+      </w:r>
+      <w:r>
+        <w:rPr>
+          <w:rFonts w:ascii="rawline, sans-serif" w:hAnsi="rawline, sans-serif"/>
+          <w:b/>
+          <w:color w:val="162937"/>
+          <w:lang w:val="pt-BR"/>
+        </w:rPr>
+        <w:t xml:space="preserve"> </w:t>
+      </w:r>
+      <w:r>
+        <w:rPr>
+          <w:rFonts w:ascii="rawline, sans-serif" w:hAnsi="rawline, sans-serif"/>
+          <w:b/>
+          <w:color w:val="162937"/>
+          <w:lang w:val="pt-BR"/>
+        </w:rPr>
+        <w:t>contratados no Brasil para atuarem como consultores da ONU ou de</w:t>
+      </w:r>
+      <w:r>
+        <w:rPr>
+          <w:rFonts w:ascii="rawline, sans-serif" w:hAnsi="rawline, sans-serif"/>
+          <w:b/>
+          <w:color w:val="162937"/>
+          <w:lang w:val="pt-BR"/>
+        </w:rPr>
+        <w:t xml:space="preserve"> </w:t>
+      </w:r>
+      <w:r>
+        <w:rPr>
+          <w:rFonts w:ascii="rawline, sans-serif" w:hAnsi="rawline, sans-serif"/>
+          <w:b/>
+          <w:color w:val="162937"/>
+          <w:lang w:val="pt-BR"/>
+        </w:rPr>
+        <w:t>suas Agências Especializadas, nem inscrevê-los em Dívida Ativa da</w:t>
+      </w:r>
+      <w:r>
+        <w:rPr>
+          <w:rFonts w:ascii="rawline, sans-serif" w:hAnsi="rawline, sans-serif"/>
+          <w:b/>
+          <w:color w:val="162937"/>
+          <w:lang w:val="pt-BR"/>
+        </w:rPr>
+        <w:t xml:space="preserve"> </w:t>
+      </w:r>
+      <w:r>
+        <w:rPr>
+          <w:rFonts w:ascii="rawline, sans-serif" w:hAnsi="rawline, sans-serif"/>
+          <w:b/>
+          <w:color w:val="162937"/>
+          <w:lang w:val="pt-BR"/>
+        </w:rPr>
+        <w:t>União, devendo, ainda, rever de ofício os lançamentos e as inscrições</w:t>
+      </w:r>
+      <w:r>
+        <w:rPr>
+          <w:rFonts w:ascii="rawline, sans-serif" w:hAnsi="rawline, sans-serif"/>
+          <w:b/>
+          <w:color w:val="162937"/>
+          <w:lang w:val="pt-BR"/>
+        </w:rPr>
+        <w:t xml:space="preserve"> </w:t>
+      </w:r>
+      <w:r>
+        <w:rPr>
+          <w:rFonts w:ascii="rawline, sans-serif" w:hAnsi="rawline, sans-serif"/>
+          <w:b/>
+          <w:color w:val="162937"/>
+          <w:lang w:val="pt-BR"/>
+        </w:rPr>
+        <w:t>já efetuadas, respeitados os prazos que limitam o exercício de direitos</w:t>
+      </w:r>
+      <w:r>
+        <w:rPr>
+          <w:rFonts w:ascii="rawline, sans-serif" w:hAnsi="rawline, sans-serif"/>
+          <w:b/>
+          <w:color w:val="162937"/>
+          <w:lang w:val="pt-BR"/>
+        </w:rPr>
+        <w:t xml:space="preserve"> </w:t>
+      </w:r>
+      <w:r>
+        <w:rPr>
+          <w:rFonts w:ascii="rawline, sans-serif" w:hAnsi="rawline, sans-serif"/>
+          <w:b/>
+          <w:color w:val="162937"/>
+          <w:lang w:val="pt-BR"/>
+        </w:rPr>
+        <w:t>por parte dos contribuintes, em razão das disposições expressas no</w:t>
+      </w:r>
+      <w:r>
+        <w:rPr>
+          <w:rFonts w:ascii="rawline, sans-serif" w:hAnsi="rawline, sans-serif"/>
+          <w:b/>
+          <w:color w:val="162937"/>
+          <w:lang w:val="pt-BR"/>
+        </w:rPr>
+        <w:t xml:space="preserve"> </w:t>
+      </w:r>
+      <w:r>
+        <w:rPr>
+          <w:rFonts w:ascii="rawline, sans-serif" w:hAnsi="rawline, sans-serif"/>
+          <w:b/>
+          <w:color w:val="162937"/>
+          <w:lang w:val="pt-BR"/>
+        </w:rPr>
+        <w:t>REsp nº 1.306.393/DF, julgado pelo STJ na sistemática prevista no</w:t>
+      </w:r>
+      <w:r>
+        <w:rPr>
+          <w:rFonts w:ascii="rawline, sans-serif" w:hAnsi="rawline, sans-serif"/>
+          <w:b/>
+          <w:color w:val="162937"/>
+          <w:lang w:val="pt-BR"/>
+        </w:rPr>
+        <w:t xml:space="preserve"> </w:t>
+      </w:r>
+      <w:r>
+        <w:rPr>
+          <w:rFonts w:ascii="rawline, sans-serif" w:hAnsi="rawline, sans-serif"/>
+          <w:b/>
+          <w:color w:val="162937"/>
+          <w:lang w:val="pt-BR"/>
+        </w:rPr>
+        <w:t>art. 543-C do Código de Processo Civil (CPC), e tendo em vista a</w:t>
+      </w:r>
+      <w:r>
+        <w:rPr>
+          <w:rFonts w:ascii="rawline, sans-serif" w:hAnsi="rawline, sans-serif"/>
+          <w:b/>
+          <w:color w:val="162937"/>
+          <w:lang w:val="pt-BR"/>
+        </w:rPr>
+        <w:t xml:space="preserve"> </w:t>
+      </w:r>
+      <w:r>
+        <w:rPr>
+          <w:rFonts w:ascii="rawline, sans-serif" w:hAnsi="rawline, sans-serif"/>
+          <w:b/>
+          <w:color w:val="162937"/>
+          <w:lang w:val="pt-BR"/>
+        </w:rPr>
+        <w:t>Nota PGFN/CRJ nº 1.549, de 2012.</w:t>
       </w:r>
     </w:p>
     <w:p>
@@ -111,7 +255,79 @@
           <w:color w:val="162937"/>
           <w:lang w:val="pt-BR"/>
         </w:rPr>
-        <w:t>DISPOSITIVOS LEGAIS: Decreto nº 59.308, de 23 de setembrode 1966; Decreto nº 52.288, de 24 de junho de 1963; Decretonº 27.784, de 16 de fevereiro de 1950; Nota PGFN/CRJ nº 1.549, de3 de dezembro de 2012; REsp nº 1.306.393/DF; Solução de ConsultaCosit nº 64, de 7 de março de 2014.</w:t>
+        <w:t>DISPOSITIVOS LEGAIS: Decreto nº 59.308, de 23 de setembro</w:t>
+      </w:r>
+      <w:r>
+        <w:rPr>
+          <w:rFonts w:ascii="rawline, sans-serif" w:hAnsi="rawline, sans-serif"/>
+          <w:b/>
+          <w:color w:val="162937"/>
+          <w:lang w:val="pt-BR"/>
+        </w:rPr>
+        <w:t xml:space="preserve"> </w:t>
+      </w:r>
+      <w:r>
+        <w:rPr>
+          <w:rFonts w:ascii="rawline, sans-serif" w:hAnsi="rawline, sans-serif"/>
+          <w:b/>
+          <w:color w:val="162937"/>
+          <w:lang w:val="pt-BR"/>
+        </w:rPr>
+        <w:t>de 1966; Decreto nº 52.288, de 24 de junho de 1963; Decreto</w:t>
+      </w:r>
+      <w:r>
+        <w:rPr>
+          <w:rFonts w:ascii="rawline, sans-serif" w:hAnsi="rawline, sans-serif"/>
+          <w:b/>
+          <w:color w:val="162937"/>
+          <w:lang w:val="pt-BR"/>
+        </w:rPr>
+        <w:t xml:space="preserve"> </w:t>
+      </w:r>
+      <w:r>
+        <w:rPr>
+          <w:rFonts w:ascii="rawline, sans-serif" w:hAnsi="rawline, sans-serif"/>
+          <w:b/>
+          <w:color w:val="162937"/>
+          <w:lang w:val="pt-BR"/>
+        </w:rPr>
+        <w:t>nº 27.784, de 16 de fevereiro de 1950; Nota PGFN/CRJ nº 1.549, de</w:t>
+      </w:r>
+      <w:r>
+        <w:rPr>
+          <w:rFonts w:ascii="rawline, sans-serif" w:hAnsi="rawline, sans-serif"/>
+          <w:b/>
+          <w:color w:val="162937"/>
+          <w:lang w:val="pt-BR"/>
+        </w:rPr>
+        <w:t xml:space="preserve"> </w:t>
+      </w:r>
+      <w:r>
+        <w:rPr>
+          <w:rFonts w:ascii="rawline, sans-serif" w:hAnsi="rawline, sans-serif"/>
+          <w:b/>
+          <w:color w:val="162937"/>
+          <w:lang w:val="pt-BR"/>
+        </w:rPr>
+        <w:t>3 de dezembro de 2012; REsp nº 1.306.393/DF; Solução de Consulta</w:t>
+      </w:r>
+      <w:r>
+        <w:rPr>
+          <w:rFonts w:ascii="rawline, sans-serif" w:hAnsi="rawline, sans-serif"/>
+          <w:b/>
+          <w:color w:val="162937"/>
+          <w:lang w:val="pt-BR"/>
+        </w:rPr>
+        <w:t xml:space="preserve"> </w:t>
+      </w:r>
+      <w:r>
+        <w:rPr>
+          <w:rFonts w:ascii="rawline, sans-serif" w:hAnsi="rawline, sans-serif"/>
+          <w:b/>
+          <w:color w:val="162937"/>
+          <w:lang w:val="pt-BR"/>
+        </w:rPr>
+        <w:t>Cosit nº 64, de 7 de março de 2014.</w:t>
       </w:r>
     </w:p>
     <w:p>
@@ -134,7 +350,25 @@
           <w:caps/>
           <w:color w:val="162937"/>
         </w:rPr>
-        <w:t>FERNANDO MOMBELLI</w:t>
+        <w:t>FERNAND</w:t>
+      </w:r>
+      <w:r>
+        <w:rPr>
+          <w:rFonts w:ascii="rawline, sans-serif" w:hAnsi="rawline, sans-serif"/>
+          <w:b/>
+          <w:caps/>
+          <w:color w:val="162937"/>
+        </w:rPr>
+        <w:t xml:space="preserve">O </w:t>
+      </w:r>
+      <w:r>
+        <w:rPr>
+          <w:rFonts w:ascii="rawline, sans-serif" w:hAnsi="rawline, sans-serif"/>
+          <w:b/>
+          <w:caps/>
+          <w:color w:val="162937"/>
+        </w:rPr>
+        <w:t>MOMBELLI</w:t>
       </w:r>
       <w:r>
         <w:rPr>

</xml_diff>